<commit_message>
Fix MS Word rendering natively by stripping glowing SVG filters across 22 figures
</commit_message>
<xml_diff>
--- a/chapters/word_output/CH-001_Anatomia_Corneana.docx
+++ b/chapters/word_output/CH-001_Anatomia_Corneana.docx
@@ -2287,7 +2287,7 @@
       <w:r>
         <w:drawing>
           <wp:inline distT="0" distB="0" distL="0" distR="0">
-            <wp:extent cx="3600450" cy="3600450"/>
+            <wp:extent cx="5038725" cy="3600450"/>
             <wp:effectExtent t="0" r="0" b="0" l="0"/>
             <wp:docPr id="1" name="" descr="" title=""/>
             <wp:cNvGraphicFramePr>
@@ -2312,7 +2312,7 @@
                   <pic:spPr bwMode="auto">
                     <a:xfrm>
                       <a:off x="0" y="0"/>
-                      <a:ext cx="3600450" cy="3600450"/>
+                      <a:ext cx="5038725" cy="3600450"/>
                     </a:xfrm>
                     <a:prstGeom prst="rect">
                       <a:avLst/>
@@ -5503,7 +5503,7 @@
       <w:r>
         <w:drawing>
           <wp:inline distT="0" distB="0" distL="0" distR="0">
-            <wp:extent cx="3600450" cy="3600450"/>
+            <wp:extent cx="5038725" cy="3600450"/>
             <wp:effectExtent t="0" r="0" b="0" l="0"/>
             <wp:docPr id="1" name="" descr="" title=""/>
             <wp:cNvGraphicFramePr>
@@ -5528,7 +5528,7 @@
                   <pic:spPr bwMode="auto">
                     <a:xfrm>
                       <a:off x="0" y="0"/>
-                      <a:ext cx="3600450" cy="3600450"/>
+                      <a:ext cx="5038725" cy="3600450"/>
                     </a:xfrm>
                     <a:prstGeom prst="rect">
                       <a:avLst/>
@@ -17958,7 +17958,7 @@
       <w:r>
         <w:drawing>
           <wp:inline distT="0" distB="0" distL="0" distR="0">
-            <wp:extent cx="3600450" cy="3600450"/>
+            <wp:extent cx="5038725" cy="3600450"/>
             <wp:effectExtent t="0" r="0" b="0" l="0"/>
             <wp:docPr id="1" name="" descr="" title=""/>
             <wp:cNvGraphicFramePr>
@@ -17983,7 +17983,7 @@
                   <pic:spPr bwMode="auto">
                     <a:xfrm>
                       <a:off x="0" y="0"/>
-                      <a:ext cx="3600450" cy="3600450"/>
+                      <a:ext cx="5038725" cy="3600450"/>
                     </a:xfrm>
                     <a:prstGeom prst="rect">
                       <a:avLst/>

</xml_diff>